<commit_message>
Added unfinished notes from Semester 06.
</commit_message>
<xml_diff>
--- a/Semester 06/CSE 4643 (Mobile Application Development)/Assignments/Assignment 02.docx
+++ b/Semester 06/CSE 4643 (Mobile Application Development)/Assignments/Assignment 02.docx
@@ -21285,7 +21285,7 @@
           <w:tab w:val="left" w:pos="14656"/>
         </w:tabs>
         <w:spacing w:after="0" w:line="240" w:lineRule="auto"/>
-        <w:jc w:val="left"/>
+        <w:jc w:val="right"/>
         <w:rPr>
           <w:rFonts w:ascii="Victor Mono" w:eastAsia="Times New Roman" w:hAnsi="Victor Mono" w:cs="Courier New"/>
           <w:color w:val="D1D5DA"/>
@@ -21294,6 +21294,16 @@
           <w:lang w:eastAsia="en-GB"/>
         </w:rPr>
       </w:pPr>
+      <w:r>
+        <w:rPr>
+          <w:rFonts w:ascii="Victor Mono" w:eastAsia="Times New Roman" w:hAnsi="Victor Mono" w:cs="Courier New"/>
+          <w:color w:val="D1D5DA"/>
+          <w:sz w:val="21"/>
+          <w:szCs w:val="21"/>
+          <w:lang w:eastAsia="en-GB"/>
+        </w:rPr>
+        <w:t>JAVA</w:t>
+      </w:r>
     </w:p>
     <w:p>
       <w:pPr>

</xml_diff>